<commit_message>
Update wording to وكيل and format Word document dates in DD/MM/YYYY and Arabic words
</commit_message>
<xml_diff>
--- a/assets/templates/agency_template.docx
+++ b/assets/templates/agency_template.docx
@@ -215,7 +215,7 @@
         <w:rPr>
           <w:rtl/>
         </w:rPr>
-        <w:t xml:space="preserve">بيانات الموكَّل إليه</w:t>
+        <w:t xml:space="preserve">بيانات الوكيل</w:t>
       </w:r>
     </w:p>
     <w:p>
@@ -443,7 +443,7 @@
         <w:rPr>
           <w:rtl/>
         </w:rPr>
-        <w:t xml:space="preserve">توقيع الموكَّل إليه: __________________</w:t>
+        <w:t xml:space="preserve">توقيع الوكيل: __________________</w:t>
       </w:r>
     </w:p>
     <w:p>

</xml_diff>